<commit_message>
v1.1.2: make the audit script runnable from either layout
audit_manuscript.py assumed its inputs were in the working directory, so it
worked in the analysis folder but failed from three_cohort/ where the inputs
sit in results/. Inputs are now resolved by search, and the script passes
45/45 checks when run from the analysis folder, from three_cohort/, and from
the repository root.

No reported result changes in this release. The manuscript now cites tag
v1.1.2.
</commit_message>
<xml_diff>
--- a/three_cohort/MANUSCRIPT_BMC.docx
+++ b/three_cohort/MANUSCRIPT_BMC.docx
@@ -984,7 +984,7 @@
           <w:i w:val="0"/>
           <w:sz w:val="24"/>
         </w:rPr>
-        <w:t>Analyses were run in Python 3.11 with NumPy and SciPy. Scripts, gene panels, per-cohort result tables and the GSEA outputs are available at https://github.com/yyx-4113/astrocytic-wnt-pyroptosis-np (tag v1.1.1), which also carries a SHA-256 manifest for every data file and result table.</w:t>
+        <w:t>Analyses were run in Python 3.11 with NumPy and SciPy. Scripts, gene panels, per-cohort result tables and the GSEA outputs are available at https://github.com/yyx-4113/astrocytic-wnt-pyroptosis-np (tag v1.1.2), which also carries a SHA-256 manifest for every data file and result table.</w:t>
       </w:r>
     </w:p>
     <w:p>
@@ -3488,7 +3488,7 @@
           <w:i w:val="0"/>
           <w:sz w:val="24"/>
         </w:rPr>
-        <w:t xml:space="preserve"> All datasets analysed are publicly available: GSE217932, GSE256472, GSE205906 and GSE134003 (Gene Expression Omnibus, https://www.ncbi.nlm.nih.gov/geo/). Analysis code, gene panels, per-cohort result tables and GSEA outputs are available at https://github.com/yyx-4113/astrocytic-wnt-pyroptosis-np under tag v1.1.1, together with a SHA-256 manifest of all files.</w:t>
+        <w:t xml:space="preserve"> All datasets analysed are publicly available: GSE217932, GSE256472, GSE205906 and GSE134003 (Gene Expression Omnibus, https://www.ncbi.nlm.nih.gov/geo/). Analysis code, gene panels, per-cohort result tables and GSEA outputs are available at https://github.com/yyx-4113/astrocytic-wnt-pyroptosis-np under tag v1.1.2, together with a SHA-256 manifest of all files.</w:t>
       </w:r>
     </w:p>
     <w:p>

</xml_diff>

<commit_message>
v1.1.3: figure correction and figure-script fixes
- Figure 2 labelled the Wnt set as "Hallmark, 37" while the set contains 38
  symbols; the label now reads 38, matching the manuscript and Table S4.
- make_gsea_figure.py still read the GSEA table by the old q-value column name
  and crashed after the v1.1.1 relabelling. Fixed.
- All three figures regenerated from the current result files.

No reported numerical result changes.
</commit_message>
<xml_diff>
--- a/three_cohort/MANUSCRIPT_BMC.docx
+++ b/three_cohort/MANUSCRIPT_BMC.docx
@@ -984,7 +984,7 @@
           <w:i w:val="0"/>
           <w:sz w:val="24"/>
         </w:rPr>
-        <w:t>Analyses were run in Python 3.11 with NumPy and SciPy. Scripts, gene panels, per-cohort result tables and the GSEA outputs are available at https://github.com/yyx-4113/astrocytic-wnt-pyroptosis-np (tag v1.1.2), which also carries a SHA-256 manifest for every data file and result table.</w:t>
+        <w:t>Analyses were run in Python 3.11 with NumPy and SciPy. Scripts, gene panels, per-cohort result tables and the GSEA outputs are available at https://github.com/yyx-4113/astrocytic-wnt-pyroptosis-np (tag v1.1.3), which also carries a SHA-256 manifest for every data file and result table.</w:t>
       </w:r>
     </w:p>
     <w:p>
@@ -3488,7 +3488,7 @@
           <w:i w:val="0"/>
           <w:sz w:val="24"/>
         </w:rPr>
-        <w:t xml:space="preserve"> All datasets analysed are publicly available: GSE217932, GSE256472, GSE205906 and GSE134003 (Gene Expression Omnibus, https://www.ncbi.nlm.nih.gov/geo/). Analysis code, gene panels, per-cohort result tables and GSEA outputs are available at https://github.com/yyx-4113/astrocytic-wnt-pyroptosis-np under tag v1.1.2, together with a SHA-256 manifest of all files.</w:t>
+        <w:t xml:space="preserve"> All datasets analysed are publicly available: GSE217932, GSE256472, GSE205906 and GSE134003 (Gene Expression Omnibus, https://www.ncbi.nlm.nih.gov/geo/). Analysis code, gene panels, per-cohort result tables and GSEA outputs are available at https://github.com/yyx-4113/astrocytic-wnt-pyroptosis-np under tag v1.1.3, together with a SHA-256 manifest of all files.</w:t>
       </w:r>
     </w:p>
     <w:p>

</xml_diff>